<commit_message>
Documenta y mejora la Tarea 12 de Seminario I
</commit_message>
<xml_diff>
--- a/ITESCA/maestria-en-gestion-administrativa/seminario-i-mga/entregas/Tarea12_DeLaCruzMunoz.docx
+++ b/ITESCA/maestria-en-gestion-administrativa/seminario-i-mga/entregas/Tarea12_DeLaCruzMunoz.docx
@@ -18,7 +18,7 @@
           <w:noProof/>
         </w:rPr>
         <w:drawing>
-          <wp:inline distT="0" distB="0" distL="0" distR="0" wp14:anchorId="6C1DCA20" wp14:editId="4DE00E0F">
+          <wp:inline distT="0" distB="0" distL="0" distR="0" wp14:anchorId="15518AE7" wp14:editId="744A85D3">
             <wp:extent cx="5943600" cy="586740"/>
             <wp:effectExtent l="0" t="0" r="0" b="0"/>
             <wp:docPr id="1" name="Picture 1"/>
@@ -235,7 +235,7 @@
       <w:r>
         <w:fldChar w:fldCharType="separate"/>
       </w:r>
-      <w:hyperlink w:anchor="_Toc242736961" w:history="1">
+      <w:hyperlink w:anchor="_Toc242807289" w:history="1">
         <w:r>
           <w:rPr>
             <w:rStyle w:val="Hipervnculo"/>
@@ -262,7 +262,7 @@
             <w:noProof/>
             <w:webHidden/>
           </w:rPr>
-          <w:instrText xml:space="preserve"> PAGEREF _Toc242736961 \h </w:instrText>
+          <w:instrText xml:space="preserve"> PAGEREF _Toc242807289 \h </w:instrText>
         </w:r>
         <w:r>
           <w:rPr>
@@ -307,7 +307,7 @@
           <w14:ligatures w14:val="standardContextual"/>
         </w:rPr>
       </w:pPr>
-      <w:hyperlink w:anchor="_Toc242736962" w:history="1">
+      <w:hyperlink w:anchor="_Toc242807290" w:history="1">
         <w:r>
           <w:rPr>
             <w:rStyle w:val="Hipervnculo"/>
@@ -334,7 +334,7 @@
             <w:noProof/>
             <w:webHidden/>
           </w:rPr>
-          <w:instrText xml:space="preserve"> PAGEREF _Toc242736962 \h </w:instrText>
+          <w:instrText xml:space="preserve"> PAGEREF _Toc242807290 \h </w:instrText>
         </w:r>
         <w:r>
           <w:rPr>
@@ -379,7 +379,7 @@
           <w14:ligatures w14:val="standardContextual"/>
         </w:rPr>
       </w:pPr>
-      <w:hyperlink w:anchor="_Toc242736963" w:history="1">
+      <w:hyperlink w:anchor="_Toc242807291" w:history="1">
         <w:r>
           <w:rPr>
             <w:rStyle w:val="Hipervnculo"/>
@@ -406,7 +406,7 @@
             <w:noProof/>
             <w:webHidden/>
           </w:rPr>
-          <w:instrText xml:space="preserve"> PAGEREF _Toc242736963 \h </w:instrText>
+          <w:instrText xml:space="preserve"> PAGEREF _Toc242807291 \h </w:instrText>
         </w:r>
         <w:r>
           <w:rPr>
@@ -451,7 +451,7 @@
           <w14:ligatures w14:val="standardContextual"/>
         </w:rPr>
       </w:pPr>
-      <w:hyperlink w:anchor="_Toc242736964" w:history="1">
+      <w:hyperlink w:anchor="_Toc242807292" w:history="1">
         <w:r>
           <w:rPr>
             <w:rStyle w:val="Hipervnculo"/>
@@ -478,7 +478,7 @@
             <w:noProof/>
             <w:webHidden/>
           </w:rPr>
-          <w:instrText xml:space="preserve"> PAGEREF _Toc242736964 \h </w:instrText>
+          <w:instrText xml:space="preserve"> PAGEREF _Toc242807292 \h </w:instrText>
         </w:r>
         <w:r>
           <w:rPr>
@@ -523,7 +523,7 @@
           <w14:ligatures w14:val="standardContextual"/>
         </w:rPr>
       </w:pPr>
-      <w:hyperlink w:anchor="_Toc242736965" w:history="1">
+      <w:hyperlink w:anchor="_Toc242807293" w:history="1">
         <w:r>
           <w:rPr>
             <w:rStyle w:val="Hipervnculo"/>
@@ -550,7 +550,7 @@
             <w:noProof/>
             <w:webHidden/>
           </w:rPr>
-          <w:instrText xml:space="preserve"> PAGEREF _Toc242736965 \h </w:instrText>
+          <w:instrText xml:space="preserve"> PAGEREF _Toc242807293 \h </w:instrText>
         </w:r>
         <w:r>
           <w:rPr>
@@ -595,7 +595,7 @@
           <w14:ligatures w14:val="standardContextual"/>
         </w:rPr>
       </w:pPr>
-      <w:hyperlink w:anchor="_Toc242736966" w:history="1">
+      <w:hyperlink w:anchor="_Toc242807294" w:history="1">
         <w:r>
           <w:rPr>
             <w:rStyle w:val="Hipervnculo"/>
@@ -622,7 +622,7 @@
             <w:noProof/>
             <w:webHidden/>
           </w:rPr>
-          <w:instrText xml:space="preserve"> PAGEREF _Toc242736966 \h </w:instrText>
+          <w:instrText xml:space="preserve"> PAGEREF _Toc242807294 \h </w:instrText>
         </w:r>
         <w:r>
           <w:rPr>
@@ -667,7 +667,7 @@
           <w14:ligatures w14:val="standardContextual"/>
         </w:rPr>
       </w:pPr>
-      <w:hyperlink w:anchor="_Toc242736967" w:history="1">
+      <w:hyperlink w:anchor="_Toc242807295" w:history="1">
         <w:r>
           <w:rPr>
             <w:rStyle w:val="Hipervnculo"/>
@@ -694,7 +694,7 @@
             <w:noProof/>
             <w:webHidden/>
           </w:rPr>
-          <w:instrText xml:space="preserve"> PAGEREF _Toc242736967 \h </w:instrText>
+          <w:instrText xml:space="preserve"> PAGEREF _Toc242807295 \h </w:instrText>
         </w:r>
         <w:r>
           <w:rPr>
@@ -739,7 +739,7 @@
           <w14:ligatures w14:val="standardContextual"/>
         </w:rPr>
       </w:pPr>
-      <w:hyperlink w:anchor="_Toc242736968" w:history="1">
+      <w:hyperlink w:anchor="_Toc242807296" w:history="1">
         <w:r>
           <w:rPr>
             <w:rStyle w:val="Hipervnculo"/>
@@ -766,7 +766,7 @@
             <w:noProof/>
             <w:webHidden/>
           </w:rPr>
-          <w:instrText xml:space="preserve"> PAGEREF _Toc242736968 \h </w:instrText>
+          <w:instrText xml:space="preserve"> PAGEREF _Toc242807296 \h </w:instrText>
         </w:r>
         <w:r>
           <w:rPr>
@@ -811,7 +811,7 @@
           <w14:ligatures w14:val="standardContextual"/>
         </w:rPr>
       </w:pPr>
-      <w:hyperlink w:anchor="_Toc242736969" w:history="1">
+      <w:hyperlink w:anchor="_Toc242807297" w:history="1">
         <w:r>
           <w:rPr>
             <w:rStyle w:val="Hipervnculo"/>
@@ -838,7 +838,7 @@
             <w:noProof/>
             <w:webHidden/>
           </w:rPr>
-          <w:instrText xml:space="preserve"> PAGEREF _Toc242736969 \h </w:instrText>
+          <w:instrText xml:space="preserve"> PAGEREF _Toc242807297 \h </w:instrText>
         </w:r>
         <w:r>
           <w:rPr>
@@ -883,7 +883,7 @@
           <w14:ligatures w14:val="standardContextual"/>
         </w:rPr>
       </w:pPr>
-      <w:hyperlink w:anchor="_Toc242736970" w:history="1">
+      <w:hyperlink w:anchor="_Toc242807298" w:history="1">
         <w:r>
           <w:rPr>
             <w:rStyle w:val="Hipervnculo"/>
@@ -910,7 +910,7 @@
             <w:noProof/>
             <w:webHidden/>
           </w:rPr>
-          <w:instrText xml:space="preserve"> PAGEREF _Toc242736970 \h </w:instrText>
+          <w:instrText xml:space="preserve"> PAGEREF _Toc242807298 \h </w:instrText>
         </w:r>
         <w:r>
           <w:rPr>
@@ -955,7 +955,7 @@
           <w14:ligatures w14:val="standardContextual"/>
         </w:rPr>
       </w:pPr>
-      <w:hyperlink w:anchor="_Toc242736971" w:history="1">
+      <w:hyperlink w:anchor="_Toc242807299" w:history="1">
         <w:r>
           <w:rPr>
             <w:rStyle w:val="Hipervnculo"/>
@@ -982,7 +982,7 @@
             <w:noProof/>
             <w:webHidden/>
           </w:rPr>
-          <w:instrText xml:space="preserve"> PAGEREF _Toc242736971 \h </w:instrText>
+          <w:instrText xml:space="preserve"> PAGEREF _Toc242807299 \h </w:instrText>
         </w:r>
         <w:r>
           <w:rPr>
@@ -1027,7 +1027,7 @@
           <w14:ligatures w14:val="standardContextual"/>
         </w:rPr>
       </w:pPr>
-      <w:hyperlink w:anchor="_Toc242736972" w:history="1">
+      <w:hyperlink w:anchor="_Toc242807300" w:history="1">
         <w:r>
           <w:rPr>
             <w:rStyle w:val="Hipervnculo"/>
@@ -1054,7 +1054,7 @@
             <w:noProof/>
             <w:webHidden/>
           </w:rPr>
-          <w:instrText xml:space="preserve"> PAGEREF _Toc242736972 \h </w:instrText>
+          <w:instrText xml:space="preserve"> PAGEREF _Toc242807300 \h </w:instrText>
         </w:r>
         <w:r>
           <w:rPr>
@@ -1099,7 +1099,7 @@
           <w14:ligatures w14:val="standardContextual"/>
         </w:rPr>
       </w:pPr>
-      <w:hyperlink w:anchor="_Toc242736973" w:history="1">
+      <w:hyperlink w:anchor="_Toc242807301" w:history="1">
         <w:r>
           <w:rPr>
             <w:rStyle w:val="Hipervnculo"/>
@@ -1126,7 +1126,7 @@
             <w:noProof/>
             <w:webHidden/>
           </w:rPr>
-          <w:instrText xml:space="preserve"> PAGEREF _Toc242736973 \h </w:instrText>
+          <w:instrText xml:space="preserve"> PAGEREF _Toc242807301 \h </w:instrText>
         </w:r>
         <w:r>
           <w:rPr>
@@ -1171,7 +1171,7 @@
           <w14:ligatures w14:val="standardContextual"/>
         </w:rPr>
       </w:pPr>
-      <w:hyperlink w:anchor="_Toc242736974" w:history="1">
+      <w:hyperlink w:anchor="_Toc242807302" w:history="1">
         <w:r>
           <w:rPr>
             <w:rStyle w:val="Hipervnculo"/>
@@ -1198,7 +1198,7 @@
             <w:noProof/>
             <w:webHidden/>
           </w:rPr>
-          <w:instrText xml:space="preserve"> PAGEREF _Toc242736974 \h </w:instrText>
+          <w:instrText xml:space="preserve"> PAGEREF _Toc242807302 \h </w:instrText>
         </w:r>
         <w:r>
           <w:rPr>
@@ -1243,7 +1243,7 @@
           <w14:ligatures w14:val="standardContextual"/>
         </w:rPr>
       </w:pPr>
-      <w:hyperlink w:anchor="_Toc242736975" w:history="1">
+      <w:hyperlink w:anchor="_Toc242807303" w:history="1">
         <w:r>
           <w:rPr>
             <w:rStyle w:val="Hipervnculo"/>
@@ -1270,7 +1270,7 @@
             <w:noProof/>
             <w:webHidden/>
           </w:rPr>
-          <w:instrText xml:space="preserve"> PAGEREF _Toc242736975 \h </w:instrText>
+          <w:instrText xml:space="preserve"> PAGEREF _Toc242807303 \h </w:instrText>
         </w:r>
         <w:r>
           <w:rPr>
@@ -1315,7 +1315,7 @@
           <w14:ligatures w14:val="standardContextual"/>
         </w:rPr>
       </w:pPr>
-      <w:hyperlink w:anchor="_Toc242736976" w:history="1">
+      <w:hyperlink w:anchor="_Toc242807304" w:history="1">
         <w:r>
           <w:rPr>
             <w:rStyle w:val="Hipervnculo"/>
@@ -1342,7 +1342,7 @@
             <w:noProof/>
             <w:webHidden/>
           </w:rPr>
-          <w:instrText xml:space="preserve"> PAGEREF _Toc242736976 \h </w:instrText>
+          <w:instrText xml:space="preserve"> PAGEREF _Toc242807304 \h </w:instrText>
         </w:r>
         <w:r>
           <w:rPr>
@@ -1387,7 +1387,7 @@
           <w14:ligatures w14:val="standardContextual"/>
         </w:rPr>
       </w:pPr>
-      <w:hyperlink w:anchor="_Toc242736977" w:history="1">
+      <w:hyperlink w:anchor="_Toc242807305" w:history="1">
         <w:r>
           <w:rPr>
             <w:rStyle w:val="Hipervnculo"/>
@@ -1414,7 +1414,7 @@
             <w:noProof/>
             <w:webHidden/>
           </w:rPr>
-          <w:instrText xml:space="preserve"> PAGEREF _Toc242736977 \h </w:instrText>
+          <w:instrText xml:space="preserve"> PAGEREF _Toc242807305 \h </w:instrText>
         </w:r>
         <w:r>
           <w:rPr>
@@ -1434,7 +1434,7 @@
             <w:noProof/>
             <w:webHidden/>
           </w:rPr>
-          <w:t>18</w:t>
+          <w:t>19</w:t>
         </w:r>
         <w:r>
           <w:rPr>
@@ -1459,7 +1459,7 @@
           <w14:ligatures w14:val="standardContextual"/>
         </w:rPr>
       </w:pPr>
-      <w:hyperlink w:anchor="_Toc242736978" w:history="1">
+      <w:hyperlink w:anchor="_Toc242807306" w:history="1">
         <w:r>
           <w:rPr>
             <w:rStyle w:val="Hipervnculo"/>
@@ -1486,7 +1486,7 @@
             <w:noProof/>
             <w:webHidden/>
           </w:rPr>
-          <w:instrText xml:space="preserve"> PAGEREF _Toc242736978 \h </w:instrText>
+          <w:instrText xml:space="preserve"> PAGEREF _Toc242807306 \h </w:instrText>
         </w:r>
         <w:r>
           <w:rPr>
@@ -1506,7 +1506,7 @@
             <w:noProof/>
             <w:webHidden/>
           </w:rPr>
-          <w:t>18</w:t>
+          <w:t>19</w:t>
         </w:r>
         <w:r>
           <w:rPr>
@@ -1531,7 +1531,7 @@
           <w14:ligatures w14:val="standardContextual"/>
         </w:rPr>
       </w:pPr>
-      <w:hyperlink w:anchor="_Toc242736979" w:history="1">
+      <w:hyperlink w:anchor="_Toc242807307" w:history="1">
         <w:r>
           <w:rPr>
             <w:rStyle w:val="Hipervnculo"/>
@@ -1558,7 +1558,7 @@
             <w:noProof/>
             <w:webHidden/>
           </w:rPr>
-          <w:instrText xml:space="preserve"> PAGEREF _Toc242736979 \h </w:instrText>
+          <w:instrText xml:space="preserve"> PAGEREF _Toc242807307 \h </w:instrText>
         </w:r>
         <w:r>
           <w:rPr>
@@ -1578,7 +1578,7 @@
             <w:noProof/>
             <w:webHidden/>
           </w:rPr>
-          <w:t>19</w:t>
+          <w:t>20</w:t>
         </w:r>
         <w:r>
           <w:rPr>
@@ -1603,7 +1603,7 @@
           <w14:ligatures w14:val="standardContextual"/>
         </w:rPr>
       </w:pPr>
-      <w:hyperlink w:anchor="_Toc242736980" w:history="1">
+      <w:hyperlink w:anchor="_Toc242807308" w:history="1">
         <w:r>
           <w:rPr>
             <w:rStyle w:val="Hipervnculo"/>
@@ -1630,7 +1630,7 @@
             <w:noProof/>
             <w:webHidden/>
           </w:rPr>
-          <w:instrText xml:space="preserve"> PAGEREF _Toc242736980 \h </w:instrText>
+          <w:instrText xml:space="preserve"> PAGEREF _Toc242807308 \h </w:instrText>
         </w:r>
         <w:r>
           <w:rPr>
@@ -1650,7 +1650,7 @@
             <w:noProof/>
             <w:webHidden/>
           </w:rPr>
-          <w:t>21</w:t>
+          <w:t>23</w:t>
         </w:r>
         <w:r>
           <w:rPr>
@@ -1675,7 +1675,7 @@
           <w14:ligatures w14:val="standardContextual"/>
         </w:rPr>
       </w:pPr>
-      <w:hyperlink w:anchor="_Toc242736981" w:history="1">
+      <w:hyperlink w:anchor="_Toc242807309" w:history="1">
         <w:r>
           <w:rPr>
             <w:rStyle w:val="Hipervnculo"/>
@@ -1702,7 +1702,7 @@
             <w:noProof/>
             <w:webHidden/>
           </w:rPr>
-          <w:instrText xml:space="preserve"> PAGEREF _Toc242736981 \h </w:instrText>
+          <w:instrText xml:space="preserve"> PAGEREF _Toc242807309 \h </w:instrText>
         </w:r>
         <w:r>
           <w:rPr>
@@ -1722,7 +1722,7 @@
             <w:noProof/>
             <w:webHidden/>
           </w:rPr>
-          <w:t>21</w:t>
+          <w:t>23</w:t>
         </w:r>
         <w:r>
           <w:rPr>
@@ -1747,7 +1747,7 @@
           <w14:ligatures w14:val="standardContextual"/>
         </w:rPr>
       </w:pPr>
-      <w:hyperlink w:anchor="_Toc242736982" w:history="1">
+      <w:hyperlink w:anchor="_Toc242807310" w:history="1">
         <w:r>
           <w:rPr>
             <w:rStyle w:val="Hipervnculo"/>
@@ -1774,7 +1774,7 @@
             <w:noProof/>
             <w:webHidden/>
           </w:rPr>
-          <w:instrText xml:space="preserve"> PAGEREF _Toc242736982 \h </w:instrText>
+          <w:instrText xml:space="preserve"> PAGEREF _Toc242807310 \h </w:instrText>
         </w:r>
         <w:r>
           <w:rPr>
@@ -1794,7 +1794,7 @@
             <w:noProof/>
             <w:webHidden/>
           </w:rPr>
-          <w:t>21</w:t>
+          <w:t>23</w:t>
         </w:r>
         <w:r>
           <w:rPr>
@@ -1819,7 +1819,7 @@
           <w14:ligatures w14:val="standardContextual"/>
         </w:rPr>
       </w:pPr>
-      <w:hyperlink w:anchor="_Toc242736983" w:history="1">
+      <w:hyperlink w:anchor="_Toc242807311" w:history="1">
         <w:r>
           <w:rPr>
             <w:rStyle w:val="Hipervnculo"/>
@@ -1846,7 +1846,7 @@
             <w:noProof/>
             <w:webHidden/>
           </w:rPr>
-          <w:instrText xml:space="preserve"> PAGEREF _Toc242736983 \h </w:instrText>
+          <w:instrText xml:space="preserve"> PAGEREF _Toc242807311 \h </w:instrText>
         </w:r>
         <w:r>
           <w:rPr>
@@ -1866,7 +1866,7 @@
             <w:noProof/>
             <w:webHidden/>
           </w:rPr>
-          <w:t>21</w:t>
+          <w:t>23</w:t>
         </w:r>
         <w:r>
           <w:rPr>
@@ -1891,7 +1891,7 @@
           <w14:ligatures w14:val="standardContextual"/>
         </w:rPr>
       </w:pPr>
-      <w:hyperlink w:anchor="_Toc242736984" w:history="1">
+      <w:hyperlink w:anchor="_Toc242807312" w:history="1">
         <w:r>
           <w:rPr>
             <w:rStyle w:val="Hipervnculo"/>
@@ -1918,7 +1918,7 @@
             <w:noProof/>
             <w:webHidden/>
           </w:rPr>
-          <w:instrText xml:space="preserve"> PAGEREF _Toc242736984 \h </w:instrText>
+          <w:instrText xml:space="preserve"> PAGEREF _Toc242807312 \h </w:instrText>
         </w:r>
         <w:r>
           <w:rPr>
@@ -1938,7 +1938,7 @@
             <w:noProof/>
             <w:webHidden/>
           </w:rPr>
-          <w:t>21</w:t>
+          <w:t>23</w:t>
         </w:r>
         <w:r>
           <w:rPr>
@@ -1963,7 +1963,7 @@
           <w14:ligatures w14:val="standardContextual"/>
         </w:rPr>
       </w:pPr>
-      <w:hyperlink w:anchor="_Toc242736985" w:history="1">
+      <w:hyperlink w:anchor="_Toc242807313" w:history="1">
         <w:r>
           <w:rPr>
             <w:rStyle w:val="Hipervnculo"/>
@@ -1990,7 +1990,7 @@
             <w:noProof/>
             <w:webHidden/>
           </w:rPr>
-          <w:instrText xml:space="preserve"> PAGEREF _Toc242736985 \h </w:instrText>
+          <w:instrText xml:space="preserve"> PAGEREF _Toc242807313 \h </w:instrText>
         </w:r>
         <w:r>
           <w:rPr>
@@ -2010,7 +2010,7 @@
             <w:noProof/>
             <w:webHidden/>
           </w:rPr>
-          <w:t>21</w:t>
+          <w:t>23</w:t>
         </w:r>
         <w:r>
           <w:rPr>
@@ -2035,7 +2035,7 @@
           <w14:ligatures w14:val="standardContextual"/>
         </w:rPr>
       </w:pPr>
-      <w:hyperlink w:anchor="_Toc242736986" w:history="1">
+      <w:hyperlink w:anchor="_Toc242807314" w:history="1">
         <w:r>
           <w:rPr>
             <w:rStyle w:val="Hipervnculo"/>
@@ -2062,7 +2062,7 @@
             <w:noProof/>
             <w:webHidden/>
           </w:rPr>
-          <w:instrText xml:space="preserve"> PAGEREF _Toc242736986 \h </w:instrText>
+          <w:instrText xml:space="preserve"> PAGEREF _Toc242807314 \h </w:instrText>
         </w:r>
         <w:r>
           <w:rPr>
@@ -2082,7 +2082,7 @@
             <w:noProof/>
             <w:webHidden/>
           </w:rPr>
-          <w:t>22</w:t>
+          <w:t>24</w:t>
         </w:r>
         <w:r>
           <w:rPr>
@@ -2107,7 +2107,7 @@
           <w14:ligatures w14:val="standardContextual"/>
         </w:rPr>
       </w:pPr>
-      <w:hyperlink w:anchor="_Toc242736987" w:history="1">
+      <w:hyperlink w:anchor="_Toc242807315" w:history="1">
         <w:r>
           <w:rPr>
             <w:rStyle w:val="Hipervnculo"/>
@@ -2134,7 +2134,7 @@
             <w:noProof/>
             <w:webHidden/>
           </w:rPr>
-          <w:instrText xml:space="preserve"> PAGEREF _Toc242736987 \h </w:instrText>
+          <w:instrText xml:space="preserve"> PAGEREF _Toc242807315 \h </w:instrText>
         </w:r>
         <w:r>
           <w:rPr>
@@ -2154,7 +2154,7 @@
             <w:noProof/>
             <w:webHidden/>
           </w:rPr>
-          <w:t>25</w:t>
+          <w:t>27</w:t>
         </w:r>
         <w:r>
           <w:rPr>
@@ -2179,7 +2179,7 @@
           <w14:ligatures w14:val="standardContextual"/>
         </w:rPr>
       </w:pPr>
-      <w:hyperlink w:anchor="_Toc242736988" w:history="1">
+      <w:hyperlink w:anchor="_Toc242807316" w:history="1">
         <w:r>
           <w:rPr>
             <w:rStyle w:val="Hipervnculo"/>
@@ -2206,7 +2206,7 @@
             <w:noProof/>
             <w:webHidden/>
           </w:rPr>
-          <w:instrText xml:space="preserve"> PAGEREF _Toc242736988 \h </w:instrText>
+          <w:instrText xml:space="preserve"> PAGEREF _Toc242807316 \h </w:instrText>
         </w:r>
         <w:r>
           <w:rPr>
@@ -2226,7 +2226,7 @@
             <w:noProof/>
             <w:webHidden/>
           </w:rPr>
-          <w:t>26</w:t>
+          <w:t>28</w:t>
         </w:r>
         <w:r>
           <w:rPr>
@@ -2251,7 +2251,7 @@
           <w14:ligatures w14:val="standardContextual"/>
         </w:rPr>
       </w:pPr>
-      <w:hyperlink w:anchor="_Toc242736989" w:history="1">
+      <w:hyperlink w:anchor="_Toc242807317" w:history="1">
         <w:r>
           <w:rPr>
             <w:rStyle w:val="Hipervnculo"/>
@@ -2278,7 +2278,7 @@
             <w:noProof/>
             <w:webHidden/>
           </w:rPr>
-          <w:instrText xml:space="preserve"> PAGEREF _Toc242736989 \h </w:instrText>
+          <w:instrText xml:space="preserve"> PAGEREF _Toc242807317 \h </w:instrText>
         </w:r>
         <w:r>
           <w:rPr>
@@ -2298,7 +2298,7 @@
             <w:noProof/>
             <w:webHidden/>
           </w:rPr>
-          <w:t>29</w:t>
+          <w:t>31</w:t>
         </w:r>
         <w:r>
           <w:rPr>
@@ -2323,7 +2323,7 @@
         <w:pageBreakBefore/>
         <w:spacing w:before="120" w:after="80"/>
       </w:pPr>
-      <w:bookmarkStart w:id="0" w:name="_Toc242736961"/>
+      <w:bookmarkStart w:id="0" w:name="_Toc242807289"/>
       <w:r>
         <w:lastRenderedPageBreak/>
         <w:t>1 Antecedentes</w:t>
@@ -2491,7 +2491,7 @@
         <w:pageBreakBefore/>
         <w:spacing w:before="120" w:after="80"/>
       </w:pPr>
-      <w:bookmarkStart w:id="1" w:name="_Toc242736962"/>
+      <w:bookmarkStart w:id="1" w:name="_Toc242807290"/>
       <w:r>
         <w:lastRenderedPageBreak/>
         <w:t>2 Planteamiento del problema</w:t>
@@ -2508,7 +2508,7 @@
         <w:pStyle w:val="Ttulo2"/>
         <w:spacing w:before="240" w:after="80"/>
       </w:pPr>
-      <w:bookmarkStart w:id="2" w:name="_Toc242736963"/>
+      <w:bookmarkStart w:id="2" w:name="_Toc242807291"/>
       <w:r>
         <w:t>2.1 Enunciado del problema</w:t>
       </w:r>
@@ -2567,7 +2567,7 @@
         <w:pStyle w:val="Ttulo2"/>
         <w:spacing w:before="240" w:after="80"/>
       </w:pPr>
-      <w:bookmarkStart w:id="3" w:name="_Toc242736964"/>
+      <w:bookmarkStart w:id="3" w:name="_Toc242807292"/>
       <w:r>
         <w:t>2.2 Formulación del problema</w:t>
       </w:r>
@@ -2593,7 +2593,7 @@
         <w:pStyle w:val="Ttulo2"/>
         <w:spacing w:before="240" w:after="80"/>
       </w:pPr>
-      <w:bookmarkStart w:id="4" w:name="_Toc242736965"/>
+      <w:bookmarkStart w:id="4" w:name="_Toc242807293"/>
       <w:r>
         <w:lastRenderedPageBreak/>
         <w:t>2.3 Preguntas específicas</w:t>
@@ -2637,7 +2637,7 @@
         <w:pStyle w:val="Ttulo1"/>
         <w:spacing w:before="120" w:after="80"/>
       </w:pPr>
-      <w:bookmarkStart w:id="5" w:name="_Toc242736966"/>
+      <w:bookmarkStart w:id="5" w:name="_Toc242807294"/>
       <w:r>
         <w:t>3 Formulación de objetivos general y específicos</w:t>
       </w:r>
@@ -2659,7 +2659,7 @@
         <w:pStyle w:val="Ttulo2"/>
         <w:spacing w:before="120" w:after="80"/>
       </w:pPr>
-      <w:bookmarkStart w:id="6" w:name="_Toc242736967"/>
+      <w:bookmarkStart w:id="6" w:name="_Toc242807295"/>
       <w:r>
         <w:lastRenderedPageBreak/>
         <w:t>3.1 Objetivo general</w:t>
@@ -2679,7 +2679,7 @@
         <w:pStyle w:val="Ttulo2"/>
         <w:spacing w:before="120" w:after="80"/>
       </w:pPr>
-      <w:bookmarkStart w:id="7" w:name="_Toc242736968"/>
+      <w:bookmarkStart w:id="7" w:name="_Toc242807296"/>
       <w:r>
         <w:t>3.2 Objetivos específicos</w:t>
       </w:r>
@@ -2742,7 +2742,7 @@
         <w:pStyle w:val="Ttulo1"/>
         <w:spacing w:before="120" w:after="80"/>
       </w:pPr>
-      <w:bookmarkStart w:id="8" w:name="_Toc242736969"/>
+      <w:bookmarkStart w:id="8" w:name="_Toc242807297"/>
       <w:r>
         <w:t>4 Justificación</w:t>
       </w:r>
@@ -2752,7 +2752,7 @@
       <w:pPr>
         <w:pStyle w:val="Ttulo2"/>
       </w:pPr>
-      <w:bookmarkStart w:id="9" w:name="_Toc242736970"/>
+      <w:bookmarkStart w:id="9" w:name="_Toc242807298"/>
       <w:r>
         <w:t>4.1 Relevancia teórica</w:t>
       </w:r>
@@ -2773,7 +2773,7 @@
       <w:pPr>
         <w:pStyle w:val="Ttulo2"/>
       </w:pPr>
-      <w:bookmarkStart w:id="10" w:name="_Toc242736971"/>
+      <w:bookmarkStart w:id="10" w:name="_Toc242807299"/>
       <w:r>
         <w:t>4.2 Relevancia práctica</w:t>
       </w:r>
@@ -2802,7 +2802,7 @@
       <w:pPr>
         <w:pStyle w:val="Ttulo2"/>
       </w:pPr>
-      <w:bookmarkStart w:id="11" w:name="_Toc242736972"/>
+      <w:bookmarkStart w:id="11" w:name="_Toc242807300"/>
       <w:r>
         <w:t>4.3 Relevancia social e institucional</w:t>
       </w:r>
@@ -2822,7 +2822,7 @@
       <w:pPr>
         <w:pStyle w:val="Ttulo2"/>
       </w:pPr>
-      <w:bookmarkStart w:id="12" w:name="_Toc242736973"/>
+      <w:bookmarkStart w:id="12" w:name="_Toc242807301"/>
       <w:r>
         <w:t>4.4 Originalidad</w:t>
       </w:r>
@@ -2846,7 +2846,7 @@
       <w:pPr>
         <w:pStyle w:val="Ttulo2"/>
       </w:pPr>
-      <w:bookmarkStart w:id="13" w:name="_Toc242736974"/>
+      <w:bookmarkStart w:id="13" w:name="_Toc242807302"/>
       <w:r>
         <w:t>4.5 Viabilidad</w:t>
       </w:r>
@@ -2876,7 +2876,7 @@
         <w:pStyle w:val="Ttulo1"/>
         <w:spacing w:before="120" w:after="80"/>
       </w:pPr>
-      <w:bookmarkStart w:id="14" w:name="_Toc242736975"/>
+      <w:bookmarkStart w:id="14" w:name="_Toc242807303"/>
       <w:r>
         <w:t>5 Hipótesis de trabajo</w:t>
       </w:r>
@@ -2886,7 +2886,7 @@
       <w:pPr>
         <w:pStyle w:val="Ttulo2"/>
       </w:pPr>
-      <w:bookmarkStart w:id="15" w:name="_Toc242736976"/>
+      <w:bookmarkStart w:id="15" w:name="_Toc242807304"/>
       <w:r>
         <w:t>5.1 Hipótesis general</w:t>
       </w:r>
@@ -2899,23 +2899,45 @@
     </w:p>
     <w:p>
       <w:r>
-        <w:t xml:space="preserve">La variable independiente (VI), denominada aquí variable predictora y no factor manipulado, es el nivel de gestión del cumplimiento normativo. Comprende asignación documentada de responsabilidades, verificación de aplicabilidad y seguimiento de acciones. La variable dependiente (VD), como resultado documental observado, es el grado de preparación administrativa del expediente. Comprende integridad, coherencia con requisitos aplicables y </w:t>
-      </w:r>
+        <w:t>X (campo VI de la consigna) es el nivel de gestión del cumplimiento normativo: asignación documentada de responsabilidades, verificación de aplicabilidad y seguimiento de acciones. Y (campo VD) es el grado de preparación administrativa del expediente: integridad, coherencia con requisitos aplicables y cierre respaldado de observaciones. Son roles analíticos no causales; X no está manipulada ni Y es un efecto demostrado. Preparación no significa autorización gubernamental, operación legal acreditada ni formalización consumada.</w:t>
+      </w:r>
+    </w:p>
+    <w:p>
       <w:r>
         <w:lastRenderedPageBreak/>
-        <w:t>cierre respaldado de observaciones. Preparación no significa autorización gubernamental, operación legal acreditada ni formalización consumada.</w:t>
-      </w:r>
-    </w:p>
-    <w:p>
-      <w:r>
         <w:t>La hipótesis deriva de la brecha descrita en antecedentes y planteamiento: los borradores no acreditan una ruta validada entre requisitos, responsables y evidencias. Responde a la pregunta general y al objetivo de analizar esa relación mediante contraste documental. Los antecedentes justifican examinar procedimientos y controles administrativos, pero no demuestran anticipadamente la relación en vTaxi ni permiten trasladar hallazgos de otros contextos como resultados locales.</w:t>
       </w:r>
     </w:p>
     <w:p>
+      <w:r>
+        <w:t>Fundamento metodológico. Hernández Sampieri et al. (2014) definen las hipótesis como “explicaciones tentativas del fenómeno investigado” (p. 104). Por ello, HG es una respuesta provisional a la pregunta general, no una conclusión sobre vTaxi. Los autores vinculan su formulación con problema, antecedentes y marco teórico y exigen variables observables, relaciones precisas y técnicas disponibles para contrastarlas (pp. 105–107). La formulación conserva el caso, periodo y objetos documentales delimitados en lo</w:t>
+      </w:r>
+      <w:r>
+        <w:t>s capítulos anteriores.</w:t>
+      </w:r>
+    </w:p>
+    <w:p>
+      <w:r>
+        <w:t>Fundamento administrativo. El criterio 8.1 del toolkit de OECD (2018, p. 39) considera relevantes los datos actualizados, la gestión de casos, los registros y los flujos de trabajo para planear y dar seguimiento a la inspección y ejecución regulatoria. Se toma como orientación conceptual sobre trazabilidad, no como norma exigible a vTaxi: su destinatario son estructuras de inspección y supervisión, no plataformas privadas. Su adaptación al caso consiste en examinar responsables identificables, revisión de a</w:t>
+      </w:r>
+      <w:r>
+        <w:t>plicabilidad y seguimiento registrado frente a documentos verificables. Esos controles pueden facilitar la localización de brechas y su revisión, pero un expediente puede permanecer incompleto pese a ellos; de ahí que se proponga una relación contrastable y no un efecto garantizado.</w:t>
+      </w:r>
+    </w:p>
+    <w:p>
+      <w:r>
+        <w:t xml:space="preserve">Enlace con los antecedentes. Parker y Nielsen (2009), incorporados en el capítulo 1 con el alcance limitado de la revisión disponible, plantean el examen de sistemas de cumplimiento y su posible diferencia en la práctica. Ese antecedente y la orientación de OECD justifican investigar controles y evidencia, no dar por acreditada su eficacia. La inferencia de trabajo para vTaxi es propia: donde existen más controles documentados se espera encontrar mayor </w:t>
+      </w:r>
+      <w:r>
+        <w:lastRenderedPageBreak/>
+        <w:t>preparación del expediente, manteniendo separados los registros de gestión y la evaluación del documento resultante. Las divergencias también se registrarán y podrán debilitar la hipótesis.</w:t>
+      </w:r>
+    </w:p>
+    <w:p>
       <w:pPr>
         <w:pStyle w:val="Ttulo2"/>
       </w:pPr>
-      <w:bookmarkStart w:id="16" w:name="_Toc242736977"/>
+      <w:bookmarkStart w:id="16" w:name="_Toc242807305"/>
       <w:r>
         <w:t>5.2 Hipótesis específica</w:t>
       </w:r>
@@ -2935,7 +2957,7 @@
       <w:pPr>
         <w:pStyle w:val="Ttulo2"/>
       </w:pPr>
-      <w:bookmarkStart w:id="17" w:name="_Toc242736978"/>
+      <w:bookmarkStart w:id="17" w:name="_Toc242807306"/>
       <w:r>
         <w:t>5.3 Tipo de hipótesis</w:t>
       </w:r>
@@ -2943,20 +2965,34 @@
     </w:p>
     <w:p>
       <w:r>
-        <w:t>HG y HE1 son hipótesis de trabajo relacionales, direccionales positivas y no causales, formuladas para un estudio de caso documental con alcance correlacional exploratorio en el sentido de contrastar correspondencias. No se propone experimento, manipulación de la VI, comparación entre plataformas ni generalización estadística. Price et al. (2015) distinguen medición de relaciones y demostración causal; aquí VI y VD designan roles analíticos exigidos por la formulación, no causalidad comprobada.</w:t>
-      </w:r>
-    </w:p>
-    <w:p>
+        <w:t xml:space="preserve">HG y HE1 son hipótesis de investigación correlacionales por su contenido relacional, direccionales positivas y no causales. Esto clasifica la proposición, no anuncia un estudio de correlación estadística ya diseñado o ejecutado. El </w:t>
+      </w:r>
+      <w:r>
+        <w:t>procedimiento previsto para este caso es contraste documental descriptivo por patrones de correspondencia y casos contrarios. No se propone experimento, manipulación, comparación de plataformas ni generalización estadística. Hernández Sampieri et al. (2014) señalan que “Correlación y causalidad son conceptos asociados, pero distintos” (p. 111); encontrar correspondencia no demuestra que la gestión haya producido la preparación del expediente.</w:t>
+      </w:r>
+    </w:p>
+    <w:p>
+      <w:r>
+        <w:t xml:space="preserve">Convención de variables. Para responder al campo VI–VD de la consigna se identifica X: gestión del cumplimiento, y Y: preparación administrativa del expediente. En la ficha de esta actividad VI se emplea sólo como rótulo de X y VD como rótulo de Y; no se atribuyen causa y efecto. Hernández Sampieri et al. (2014, pp. 109–111) reservan la interpretación independiente/causal y dependiente/efecto para hipótesis causales; Price et al. (2015) también </w:t>
+      </w:r>
       <w:r>
         <w:lastRenderedPageBreak/>
-        <w:t>La unidad de análisis sigue siendo vTaxi y su preparación administrativa. Los componentes y observaciones documentales son unidades de registro internas, no empresas independientes ni una muestra poblacional. El contraste será inicialmente descriptivo y por patrones: buscar coincidencias, divergencias y explicaciones alternativas. No se calculará un coeficiente de correlación si no existe una base suficiente y compatible con sus supuestos. No se incluyen hipótesis nula y alternativa estadísticas, valores p o niveles de significación porque no se ha previsto una prueba inferencial.</w:t>
+        <w:t>distinguen medición no experimental y causalidad. En el análisis se usarán X e Y y no se interpretará X como variable manipulada.</w:t>
+      </w:r>
+    </w:p>
+    <w:p>
+      <w:r>
+        <w:t>La unidad de análisis es el proyecto vTaxi; los componentes del expediente y las observaciones son unidades de registro internas, no empresas independientes. Se compararán controles y calidad documental en cortes compatibles, sin tratar versiones del mismo documento como nuevos casos. No se calcularán coeficientes, valores p ni niveles de significación: no se ha previsto una prueba inferencial. La ausencia de variación o de datos evaluables impide contrastar, no confirma HG. Cualquier incorporación posterio</w:t>
+      </w:r>
+      <w:r>
+        <w:t>r de un análisis estadístico requeriría justificar previamente diseño, registros suficientes y supuestos; no se presupone en esta tarea.</w:t>
       </w:r>
     </w:p>
     <w:p>
       <w:pPr>
         <w:pStyle w:val="Ttulo2"/>
       </w:pPr>
-      <w:bookmarkStart w:id="18" w:name="_Toc242736979"/>
+      <w:bookmarkStart w:id="18" w:name="_Toc242807307"/>
       <w:r>
         <w:t>5.4 Criterios de calidad y contraste documental</w:t>
       </w:r>
@@ -2964,7 +3000,22 @@
     </w:p>
     <w:p>
       <w:r>
-        <w:t>Claridad. Se diferencian gestión (acciones y registros de control) y preparación (calidad de los documentos resultantes). Se utilizará una ficha por componente con identificador, requisito aplicable, fuente, documento revisado, fecha, versión y limitaciones de acceso. La clasificación previa de taxis concesionados, SETIAP/ERT y capacitación evita atribuir requisitos de otra modalidad a vTaxi.</w:t>
+        <w:t>Reglas observables de X e Y. Por componente, X se describirá mediante tres controles comprobables: responsable efectivamente designado, revisión de aplicabilidad fechada y seguimiento documentado; el perfil contará de cero a tres presencias sólo si los tres controles son evaluables. No verificable no se recodifica como ausencia ni entra en ese perfil. Y se observará por separado: proporción de contenidos exigibles presentes, concordancia de cada contenido con el requisito y proporción de observaciones cerra</w:t>
+      </w:r>
+      <w:r>
+        <w:t>das con evidencia aceptable. Se reportarán los indicadores individualmente, sin sumar porcentajes o inventar ponderaciones. Integridad será contenidos exigibles presentes entre contenidos exigibles evaluables; cierre será observaciones cerradas respaldadas entre observaciones evaluables. Con denominador cero se anotará no calculable. La falta de observaciones no prueba integridad. Antes del cotejo se fijarán aplicabilidad y criterios de aceptación; sólo después se examinará si perfiles con más controles coi</w:t>
+      </w:r>
+      <w:r>
+        <w:t>nciden con mejores resultados documentales comparables.</w:t>
+      </w:r>
+    </w:p>
+    <w:p>
+      <w:r>
+        <w:t xml:space="preserve">Claridad. Se diferencian gestión (acciones y registros de control) y preparación (calidad de los documentos resultantes). Se utilizará una ficha por componente con identificador, requisito aplicable, fuente, documento revisado, fecha, versión y limitaciones de acceso. La </w:t>
+      </w:r>
+      <w:r>
+        <w:lastRenderedPageBreak/>
+        <w:t>clasificación previa de taxis concesionados, SETIAP/ERT y capacitación evita atribuir requisitos de otra modalidad a vTaxi.</w:t>
       </w:r>
     </w:p>
     <w:p>
@@ -2974,21 +3025,21 @@
     </w:p>
     <w:p>
       <w:r>
-        <w:t xml:space="preserve">Verificabilidad de la VD. Una lista distinta registrará integridad de los contenidos exigibles y concordancia del documento con el requisito aplicable, sin puntuar como preparación la mera existencia de responsable o bitácora. Cada observación se clasificará abierta, cerrada con evidencia aceptable o no verificable. La proporción de cierre será observaciones con cierre respaldado entre observaciones evaluables en el mismo corte; </w:t>
+        <w:t>Verificabilidad de la VD. Una lista distinta registrará integridad de los contenidos exigibles y concordancia del documento con el requisito aplicable, sin puntuar como preparación la mera existencia de responsable o bitácora. Cada observación se clasificará abierta, cerrada con evidencia aceptable o no verificable. La proporción de cierre será observaciones con cierre respaldado entre observaciones evaluables en el mismo corte; informar los conteos. Ausencia de observaciones registradas no equivale a expediente completo ni se divide entre cero.</w:t>
+      </w:r>
+    </w:p>
+    <w:p>
+      <w:r>
+        <w:t>Separación y revisión. Los criterios de aceptabilidad documental se fijarán antes de comparar VI y VD, con fundamento y alcance por requisito. Cuando sea viable, una segunda revisión documentará acuerdos y discrepancias; no se afirma validación experta ya realizada. Una fuente inaccesible se registra no verificable, no incumplida. Comparar sólo componentes con exigencias y cortes compatibles; las versiones repetidas del mismo documento no cuentan como casos independientes.</w:t>
+      </w:r>
+    </w:p>
+    <w:p>
+      <w:r>
+        <w:t xml:space="preserve">Contraste de HG. En una matriz por componente se cotejarán los controles observados con integridad y coherencia documental en el mismo corte. Se buscará el patrón de mejor preparación cuando existen más controles documentados y se revisarán casos contrarios: controles presentes con expediente incompleto, o documentos adecuados sin controles </w:t>
       </w:r>
       <w:r>
         <w:lastRenderedPageBreak/>
-        <w:t>informar los conteos. Ausencia de observaciones registradas no equivale a expediente completo ni se divide entre cero.</w:t>
-      </w:r>
-    </w:p>
-    <w:p>
-      <w:r>
-        <w:t>Separación y revisión. Los criterios de aceptabilidad documental se fijarán antes de comparar VI y VD, con fundamento y alcance por requisito. Cuando sea viable, una segunda revisión documentará acuerdos y discrepancias; no se afirma validación experta ya realizada. Una fuente inaccesible se registra no verificable, no incumplida. Comparar sólo componentes con exigencias y cortes compatibles; las versiones repetidas del mismo documento no cuentan como casos independientes.</w:t>
-      </w:r>
-    </w:p>
-    <w:p>
-      <w:r>
-        <w:t>Contraste de HG. En una matriz por componente se cotejarán los controles observados con integridad y coherencia documental en el mismo corte. Se buscará el patrón de mejor preparación cuando existen más controles documentados y se revisarán casos contrarios: controles presentes con expediente incompleto, o documentos adecuados sin controles registrados. Tales casos pueden debilitar o acotar la hipótesis. Si no hay variación, acceso suficiente o criterios comparables, el resultado será no contrastable con la evidencia disponible, no hipótesis confirmada.</w:t>
+        <w:t>registrados. Tales casos pueden debilitar o acotar la hipótesis. Si no hay variación, acceso suficiente o criterios comparables, el resultado será no contrastable con la evidencia disponible, no hipótesis confirmada.</w:t>
       </w:r>
     </w:p>
     <w:p>
@@ -2998,11 +3049,7 @@
     </w:p>
     <w:p>
       <w:r>
-        <w:t xml:space="preserve">Pertinencia y consistencia. Las hipótesis responden al problema y objetivos sin sustituirlos ni ampliar el estudio a todas las plataformas. Su interés pertenece a la LGAC Gestión e Innovación de las Organizaciones: procedimientos, responsables, documentos, controles e indicadores. El Círculo de Covey conserva problema y objetivo general en </w:t>
-      </w:r>
-      <w:r>
-        <w:lastRenderedPageBreak/>
-        <w:t>Importante/No urgente; no se agrega la hipótesis al esquema. La clasificación establece una prioridad de planeación, no una prueba de la relación propuesta.</w:t>
+        <w:t>Pertinencia y consistencia. Las hipótesis responden al problema y objetivos sin sustituirlos ni ampliar el estudio a todas las plataformas. Su interés pertenece a la LGAC Gestión e Innovación de las Organizaciones: procedimientos, responsables, documentos, controles e indicadores. El Círculo de Covey conserva problema y objetivo general en Importante/No urgente; no se agrega la hipótesis al esquema. La clasificación establece una prioridad de planeación, no una prueba de la relación propuesta.</w:t>
       </w:r>
     </w:p>
     <w:p>
@@ -3015,8 +3062,9 @@
         <w:pStyle w:val="Ttulo1"/>
         <w:spacing w:before="120" w:after="80"/>
       </w:pPr>
-      <w:bookmarkStart w:id="19" w:name="_Toc242736980"/>
-      <w:r>
+      <w:bookmarkStart w:id="19" w:name="_Toc242807308"/>
+      <w:r>
+        <w:lastRenderedPageBreak/>
         <w:t>6 Alcances y limitaciones</w:t>
       </w:r>
       <w:bookmarkEnd w:id="19"/>
@@ -3026,7 +3074,7 @@
         <w:pStyle w:val="Ttulo2"/>
         <w:spacing w:before="240" w:after="80"/>
       </w:pPr>
-      <w:bookmarkStart w:id="20" w:name="_Toc242736981"/>
+      <w:bookmarkStart w:id="20" w:name="_Toc242807309"/>
       <w:r>
         <w:t>6.1 Alcances</w:t>
       </w:r>
@@ -3037,7 +3085,7 @@
         <w:pStyle w:val="Ttulo2"/>
         <w:spacing w:before="240" w:after="80"/>
       </w:pPr>
-      <w:bookmarkStart w:id="21" w:name="_Toc242736982"/>
+      <w:bookmarkStart w:id="21" w:name="_Toc242807310"/>
       <w:r>
         <w:t>6.2 Limitaciones</w:t>
       </w:r>
@@ -3048,7 +3096,7 @@
         <w:pStyle w:val="Ttulo1"/>
         <w:spacing w:before="120" w:after="80"/>
       </w:pPr>
-      <w:bookmarkStart w:id="22" w:name="_Toc242736983"/>
+      <w:bookmarkStart w:id="22" w:name="_Toc242807311"/>
       <w:r>
         <w:t>7 Marco teórico</w:t>
       </w:r>
@@ -3059,7 +3107,7 @@
         <w:pStyle w:val="Ttulo1"/>
         <w:spacing w:before="120" w:after="80"/>
       </w:pPr>
-      <w:bookmarkStart w:id="23" w:name="_Toc242736984"/>
+      <w:bookmarkStart w:id="23" w:name="_Toc242807312"/>
       <w:r>
         <w:t>8 Métodos o procedimientos</w:t>
       </w:r>
@@ -3071,7 +3119,7 @@
         <w:keepNext w:val="0"/>
         <w:spacing w:before="120" w:after="80"/>
       </w:pPr>
-      <w:bookmarkStart w:id="24" w:name="_Toc242736985"/>
+      <w:bookmarkStart w:id="24" w:name="_Toc242807313"/>
       <w:r>
         <w:t>9 Cronograma de actividades</w:t>
       </w:r>
@@ -3083,7 +3131,7 @@
         <w:pageBreakBefore/>
         <w:spacing w:before="120" w:after="80"/>
       </w:pPr>
-      <w:bookmarkStart w:id="25" w:name="_Toc242736986"/>
+      <w:bookmarkStart w:id="25" w:name="_Toc242807314"/>
       <w:r>
         <w:lastRenderedPageBreak/>
         <w:t>Referencias</w:t>
@@ -3132,6 +3180,15 @@
         <w:ind w:left="720" w:hanging="720"/>
       </w:pPr>
       <w:r>
+        <w:t>Hernández Sampieri, R., Fernández Collado, C., &amp; Baptista Lucio, M. del P. (2014). Metodología de la investigación (6.ª ed.). McGraw-Hill Education.</w:t>
+      </w:r>
+    </w:p>
+    <w:p>
+      <w:pPr>
+        <w:keepLines/>
+        <w:ind w:left="720" w:hanging="720"/>
+      </w:pPr>
+      <w:r>
         <w:t xml:space="preserve">Instituto de Capacitación y Educación para el Trabajo del Estado de Nuevo León. (s. f.). </w:t>
       </w:r>
       <w:r>
@@ -3194,6 +3251,7 @@
         <w:ind w:left="720" w:hanging="720"/>
       </w:pPr>
       <w:r>
+        <w:lastRenderedPageBreak/>
         <w:t xml:space="preserve">Kraus, S., Jones, P., Kailer, N., Weinmann, A., Chaparro-Banegas, N., &amp; Roig-Tierno, N. (2021). Digital transformation: An overview of the current state of the art of research. </w:t>
       </w:r>
       <w:r>
@@ -3212,7 +3270,6 @@
         <w:ind w:left="720" w:hanging="720"/>
       </w:pPr>
       <w:r>
-        <w:lastRenderedPageBreak/>
         <w:t xml:space="preserve">Melo, I. C., Queiroz, G. A., Alves Junior, P. N., de Sousa, T. B., Yushimito, W. F., &amp; Pereira, J. (2023). Sustainable digital transformation in small and medium enterprises (SMEs): A review on performance. </w:t>
       </w:r>
       <w:r>
@@ -3249,6 +3306,15 @@
         <w:ind w:left="720" w:hanging="720"/>
       </w:pPr>
       <w:r>
+        <w:t>OECD. (2018). OECD regulatory enforcement and inspections toolkit. OECD Publishing. https://doi.org/10.1787/9789264303959-en</w:t>
+      </w:r>
+    </w:p>
+    <w:p>
+      <w:pPr>
+        <w:keepLines/>
+        <w:ind w:left="720" w:hanging="720"/>
+      </w:pPr>
+      <w:r>
         <w:t xml:space="preserve">Omrani, N., Rejeb, N., Maalaoui, A., Dabić, M., &amp; Kraus, S. (2024). Drivers of digital transformation in SMEs. </w:t>
       </w:r>
       <w:r>
@@ -3311,6 +3377,7 @@
         <w:ind w:left="720" w:hanging="720"/>
       </w:pPr>
       <w:r>
+        <w:lastRenderedPageBreak/>
         <w:t xml:space="preserve">Rodríguez-Espíndola, O., Cuevas-Romo, A., Chowdhury, S., Díaz-Acevedo, N., Albores, P., Despoudi, S., Malesios, C., &amp; Dey, P. K. (2022). The role of circular economy principles and sustainable-oriented innovation to enhance social, economic and environmental performance: Evidence from Mexican SMEs. </w:t>
       </w:r>
       <w:r>
@@ -3329,7 +3396,6 @@
         <w:ind w:left="720" w:hanging="720"/>
       </w:pPr>
       <w:r>
-        <w:lastRenderedPageBreak/>
         <w:t xml:space="preserve">Teng, X., Wu, Z., &amp; Yang, F. (2022). Research on the relationship between digital transformation and performance of SMEs. </w:t>
       </w:r>
       <w:r>
@@ -3436,7 +3502,7 @@
         <w:pStyle w:val="Ttulo1"/>
         <w:pageBreakBefore/>
       </w:pPr>
-      <w:bookmarkStart w:id="26" w:name="_Toc242736987"/>
+      <w:bookmarkStart w:id="26" w:name="_Toc242807315"/>
       <w:r>
         <w:lastRenderedPageBreak/>
         <w:t>Anexo 1 Matriz de consistencia</w:t>
@@ -3665,7 +3731,7 @@
         <w:pStyle w:val="Ttulo2"/>
         <w:pageBreakBefore/>
       </w:pPr>
-      <w:bookmarkStart w:id="27" w:name="_Toc242736988"/>
+      <w:bookmarkStart w:id="27" w:name="_Toc242807316"/>
       <w:r>
         <w:lastRenderedPageBreak/>
         <w:t>Correspondencia de preguntas y objetivos específicos</w:t>
@@ -4171,7 +4237,7 @@
         <w:pStyle w:val="Ttulo1"/>
         <w:pageBreakBefore/>
       </w:pPr>
-      <w:bookmarkStart w:id="28" w:name="_Toc242736989"/>
+      <w:bookmarkStart w:id="28" w:name="_Toc242807317"/>
       <w:r>
         <w:lastRenderedPageBreak/>
         <w:t>Anexo 2 Círculo de Covey</w:t>

</xml_diff>

<commit_message>
Integra portada y sincronizacion de Tarea 12 Seminario I
</commit_message>
<xml_diff>
--- a/ITESCA/maestria-en-gestion-administrativa/seminario-i-mga/entregas/Tarea12_DeLaCruzMunoz.docx
+++ b/ITESCA/maestria-en-gestion-administrativa/seminario-i-mga/entregas/Tarea12_DeLaCruzMunoz.docx
@@ -3,203 +3,50 @@
 <w:document xmlns:wpc="http://schemas.microsoft.com/office/word/2010/wordprocessingCanvas" xmlns:cx="http://schemas.microsoft.com/office/drawing/2014/chartex" xmlns:cx1="http://schemas.microsoft.com/office/drawing/2015/9/8/chartex" xmlns:cx2="http://schemas.microsoft.com/office/drawing/2015/10/21/chartex" xmlns:cx3="http://schemas.microsoft.com/office/drawing/2016/5/9/chartex" xmlns:cx4="http://schemas.microsoft.com/office/drawing/2016/5/10/chartex" xmlns:cx5="http://schemas.microsoft.com/office/drawing/2016/5/11/chartex" xmlns:cx6="http://schemas.microsoft.com/office/drawing/2016/5/12/chartex" xmlns:cx7="http://schemas.microsoft.com/office/drawing/2016/5/13/chartex" xmlns:cx8="http://schemas.microsoft.com/office/drawing/2016/5/14/chartex" xmlns:mc="http://schemas.openxmlformats.org/markup-compatibility/2006" xmlns:aink="http://schemas.microsoft.com/office/drawing/2016/ink" xmlns:am3d="http://schemas.microsoft.com/office/drawing/2017/model3d" xmlns:o="urn:schemas-microsoft-com:office:office" xmlns:oel="http://schemas.microsoft.com/office/2019/extlst" xmlns:r="http://schemas.openxmlformats.org/officeDocument/2006/relationships" xmlns:m="http://schemas.openxmlformats.org/officeDocument/2006/math" xmlns:v="urn:schemas-microsoft-com:vml" xmlns:wp14="http://schemas.microsoft.com/office/word/2010/wordprocessingDrawing" xmlns:wp="http://schemas.openxmlformats.org/drawingml/2006/wordprocessingDrawing" xmlns:w10="urn:schemas-microsoft-com:office:word" xmlns:w="http://schemas.openxmlformats.org/wordprocessingml/2006/main" xmlns:w14="http://schemas.microsoft.com/office/word/2010/wordml" xmlns:w15="http://schemas.microsoft.com/office/word/2012/wordml" xmlns:w16cex="http://schemas.microsoft.com/office/word/2018/wordml/cex" xmlns:w16cid="http://schemas.microsoft.com/office/word/2016/wordml/cid" xmlns:w16="http://schemas.microsoft.com/office/word/2018/wordml" xmlns:w16sdtdh="http://schemas.microsoft.com/office/word/2020/wordml/sdtdatahash" xmlns:w16se="http://schemas.microsoft.com/office/word/2015/wordml/symex" xmlns:wpg="http://schemas.microsoft.com/office/word/2010/wordprocessingGroup" xmlns:wpi="http://schemas.microsoft.com/office/word/2010/wordprocessingInk" xmlns:wne="http://schemas.microsoft.com/office/word/2006/wordml" xmlns:wps="http://schemas.microsoft.com/office/word/2010/wordprocessingShape" mc:Ignorable="w14 w15 w16se w16cid w16 w16cex w16sdtdh wp14">
   <w:body>
     <w:p>
-      <w:r>
-        <w:t>Semestre: primero. Delimitación del estudio: Monterrey, Nuevo León.</w:t>
-      </w:r>
-    </w:p>
-    <w:p>
-      <w:pPr>
-        <w:pStyle w:val="APAportada"/>
-        <w:keepNext/>
-        <w:spacing w:after="400"/>
-      </w:pPr>
-      <w:r>
-        <w:rPr>
-          <w:noProof/>
-        </w:rPr>
+      <w:pPr>
+        <w:spacing w:before="0" w:after="0"/>
+      </w:pPr>
+      <w:r>
         <w:drawing>
-          <wp:inline distT="0" distB="0" distL="0" distR="0" wp14:anchorId="15518AE7" wp14:editId="744A85D3">
-            <wp:extent cx="5943600" cy="586740"/>
-            <wp:effectExtent l="0" t="0" r="0" b="0"/>
+          <wp:anchor distT="0" distB="0" distL="0" distR="0" simplePos="0" relativeHeight="0" behindDoc="1" locked="1" layoutInCell="1" allowOverlap="1">
+            <wp:simplePos x="0" y="0"/>
+            <wp:positionH relativeFrom="page">
+              <wp:posOffset>0</wp:posOffset>
+            </wp:positionH>
+            <wp:positionV relativeFrom="page">
+              <wp:posOffset>0</wp:posOffset>
+            </wp:positionV>
+            <wp:extent cx="7772400" cy="10058400"/>
+            <wp:wrapNone/>
             <wp:docPr id="1" name="Picture 1"/>
-            <wp:cNvGraphicFramePr>
-              <a:graphicFrameLocks xmlns:a="http://schemas.openxmlformats.org/drawingml/2006/main" noChangeAspect="1"/>
+            <wp:cNvGraphicFramePr xmlns:a="http://schemas.openxmlformats.org/drawingml/2006/main">
+              <a:graphicFrameLocks noChangeAspect="1"/>
             </wp:cNvGraphicFramePr>
-            <a:graphic xmlns:a="http://schemas.openxmlformats.org/drawingml/2006/main">
+            <a:graphic xmlns:a="http://schemas.openxmlformats.org/drawingml/2006/main" xmlns:pic="http://schemas.openxmlformats.org/drawingml/2006/picture">
               <a:graphicData uri="http://schemas.openxmlformats.org/drawingml/2006/picture">
-                <pic:pic xmlns:pic="http://schemas.openxmlformats.org/drawingml/2006/picture">
+                <pic:pic>
                   <pic:nvPicPr>
-                    <pic:cNvPr id="1" name="Picture 1"/>
-                    <pic:cNvPicPr>
-                      <a:picLocks noChangeAspect="1" noChangeArrowheads="1"/>
-                    </pic:cNvPicPr>
+                    <pic:cNvPr id="0" name="portada-t12.png"/>
+                    <pic:cNvPicPr/>
                   </pic:nvPicPr>
                   <pic:blipFill>
-                    <a:blip r:embed="rId7"/>
+                    <a:blip r:embed="rId16"/>
                     <a:stretch>
                       <a:fillRect/>
                     </a:stretch>
                   </pic:blipFill>
-                  <pic:spPr bwMode="auto">
+                  <pic:spPr>
                     <a:xfrm>
                       <a:off x="0" y="0"/>
-                      <a:ext cx="5943600" cy="586740"/>
+                      <a:ext cx="7772400" cy="10058400"/>
                     </a:xfrm>
-                    <a:prstGeom prst="rect">
-                      <a:avLst/>
-                    </a:prstGeom>
+                    <a:prstGeom prst="rect"/>
                   </pic:spPr>
                 </pic:pic>
               </a:graphicData>
             </a:graphic>
-          </wp:inline>
+          </wp:anchor>
         </w:drawing>
-      </w:r>
-    </w:p>
-    <w:p>
-      <w:pPr>
-        <w:pStyle w:val="APAportada"/>
-        <w:spacing w:after="200" w:line="360" w:lineRule="auto"/>
-      </w:pPr>
-      <w:r>
-        <w:rPr>
-          <w:b/>
-        </w:rPr>
-        <w:t>INSTITUTO TECNOLÓGICO SUPERIOR DE CAJEME</w:t>
-      </w:r>
-    </w:p>
-    <w:p>
-      <w:pPr>
-        <w:pStyle w:val="Ttulo"/>
-        <w:spacing w:after="280" w:line="360" w:lineRule="auto"/>
-        <w:ind w:firstLine="0"/>
-      </w:pPr>
-      <w:r>
-        <w:t>Gestión del cumplimiento normativo para formalizar vTaxi como plataforma de taxis en Nuevo León</w:t>
-      </w:r>
-    </w:p>
-    <w:p>
-      <w:pPr>
-        <w:pStyle w:val="APAportada"/>
-        <w:spacing w:after="200" w:line="360" w:lineRule="auto"/>
-      </w:pPr>
-      <w:r>
-        <w:t>Seminario I</w:t>
-      </w:r>
-      <w:r>
-        <w:br/>
-        <w:t>Actividad 12 Hipótesis de trabajo</w:t>
-      </w:r>
-    </w:p>
-    <w:p>
-      <w:pPr>
-        <w:pStyle w:val="APAportada"/>
-        <w:spacing w:after="200" w:line="360" w:lineRule="auto"/>
-      </w:pPr>
-      <w:r>
-        <w:rPr>
-          <w:b/>
-        </w:rPr>
-        <w:t>MAESTRÍA EN GESTIÓN ADMINISTRATIVA</w:t>
-      </w:r>
-    </w:p>
-    <w:p>
-      <w:pPr>
-        <w:pStyle w:val="APAportada"/>
-        <w:spacing w:after="200" w:line="360" w:lineRule="auto"/>
-      </w:pPr>
-      <w:r>
-        <w:t>Línea de Generación y Aplicación del Conocimiento</w:t>
-      </w:r>
-    </w:p>
-    <w:p>
-      <w:pPr>
-        <w:pStyle w:val="APAportada"/>
-        <w:spacing w:after="200" w:line="360" w:lineRule="auto"/>
-      </w:pPr>
-      <w:r>
-        <w:rPr>
-          <w:b/>
-        </w:rPr>
-        <w:t>Gestión e Innovación de las Organizaciones</w:t>
-      </w:r>
-    </w:p>
-    <w:p>
-      <w:pPr>
-        <w:pStyle w:val="APAportada"/>
-        <w:spacing w:after="80" w:line="360" w:lineRule="auto"/>
-      </w:pPr>
-    </w:p>
-    <w:p>
-      <w:pPr>
-        <w:pStyle w:val="APAportada"/>
-        <w:spacing w:after="200" w:line="360" w:lineRule="auto"/>
-      </w:pPr>
-      <w:r>
-        <w:t>PRESENTA</w:t>
-      </w:r>
-    </w:p>
-    <w:p>
-      <w:pPr>
-        <w:pStyle w:val="APAportada"/>
-        <w:spacing w:after="200" w:line="360" w:lineRule="auto"/>
-      </w:pPr>
-      <w:r>
-        <w:rPr>
-          <w:b/>
-        </w:rPr>
-        <w:t>MARTÍN JONATHAN DE LA CRUZ MUÑOZ</w:t>
-      </w:r>
-    </w:p>
-    <w:p>
-      <w:pPr>
-        <w:pStyle w:val="APAportada"/>
-        <w:spacing w:after="200" w:line="360" w:lineRule="auto"/>
-      </w:pPr>
-      <w:r>
-        <w:t>Matrícula 26130503</w:t>
-      </w:r>
-    </w:p>
-    <w:p>
-      <w:pPr>
-        <w:pStyle w:val="APAportada"/>
-        <w:spacing w:after="200" w:line="360" w:lineRule="auto"/>
-      </w:pPr>
-      <w:r>
-        <w:t>DOCENTE DE SEMINARIO I</w:t>
-      </w:r>
-    </w:p>
-    <w:p>
-      <w:pPr>
-        <w:pStyle w:val="APAportada"/>
-        <w:spacing w:after="200" w:line="360" w:lineRule="auto"/>
-      </w:pPr>
-      <w:r>
-        <w:rPr>
-          <w:b/>
-        </w:rPr>
-        <w:t>DRA. CARLA OLIMPYA ZAPUCHE MORENO</w:t>
-      </w:r>
-    </w:p>
-    <w:p>
-      <w:pPr>
-        <w:pStyle w:val="APAportada"/>
-        <w:spacing w:after="80" w:line="360" w:lineRule="auto"/>
-      </w:pPr>
-    </w:p>
-    <w:p>
-      <w:pPr>
-        <w:pStyle w:val="APAportada"/>
-        <w:spacing w:after="200" w:line="360" w:lineRule="auto"/>
-      </w:pPr>
-      <w:r>
-        <w:t>CIUDAD OBREGÓN, SONORA</w:t>
-      </w:r>
-      <w:r>
-        <w:br/>
-      </w:r>
-      <w:r>
-        <w:t>12 DE OCTUBRE DE 2026</w:t>
       </w:r>
     </w:p>
     <w:p>

</xml_diff>